<commit_message>
Add corretor de peça processual app with direct Anthropic API integration
Update roteiro docx with Caso 3 content and example pieces
</commit_message>
<xml_diff>
--- a/Demostração Claude Code/Roteiro_Demonstracao_Apps_ClaudeCode_Modulo3.docx
+++ b/Demostração Claude Code/Roteiro_Demonstracao_Apps_ClaudeCode_Modulo3.docx
@@ -615,7 +615,15 @@
         <w:spacing w:after="140"/>
       </w:pPr>
       <w:r>
-        <w:t xml:space="preserve">"Este segundo exemplo retoma o Gem “corretor de peças” que já vimos no Módulo 1 — mas agora como uma aplicação própria, com uma tela dedicada e critérios de correção fixos, prontos para reaproveitar."</w:t>
+        <w:t xml:space="preserve">"Este segundo exemplo retoma o Gem “corretor de peças” que já vimos no Módulo 1 — mas agora como uma aplicação própria, que já entrega o resultado direto na tela, com os critérios de correção ajustáveis por mim antes de corrigir."</w:t>
+      </w:r>
+    </w:p>
+    <w:p>
+      <w:pPr>
+        <w:spacing w:after="140"/>
+      </w:pPr>
+      <w:r>
+        <w:t xml:space="preserve">Diferente do Caso 2, esta aplicação não pede para copiar um prompt em outro lugar — ela mesma se conecta à IA e mostra o resultado ali dentro. Isso exige uma configuração técnica extra (uma chave de acesso à API da Anthropic). Veja a observação técnica ao final do prompt de construção.</w:t>
       </w:r>
     </w:p>
     <w:p>
@@ -670,20 +678,46 @@
                 <w:sz w:val="19"/>
                 <w:szCs w:val="19"/>
               </w:rPr>
-              <w:t xml:space="preserve">Crie uma aplicação web simples, em um único arquivo HTML com CSS e</w:t>
-            </w:r>
-          </w:p>
-          <w:p>
-            <w:pPr>
-              <w:spacing w:after="40"/>
-            </w:pPr>
-            <w:r>
-              <w:rPr>
-                <w:rFonts w:ascii="Consolas" w:cs="Consolas" w:eastAsia="Consolas" w:hAnsi="Consolas"/>
-                <w:sz w:val="19"/>
-                <w:szCs w:val="19"/>
-              </w:rPr>
-              <w:t xml:space="preserve">JavaScript, chamada "Corretor de Peça Processual". A interface deve ter:</w:t>
+              <w:t xml:space="preserve">Crie uma aplicação web (HTML, CSS e JavaScript) chamada "Corretor de Peça</w:t>
+            </w:r>
+          </w:p>
+          <w:p>
+            <w:pPr>
+              <w:spacing w:after="40"/>
+            </w:pPr>
+            <w:r>
+              <w:rPr>
+                <w:rFonts w:ascii="Consolas" w:cs="Consolas" w:eastAsia="Consolas" w:hAnsi="Consolas"/>
+                <w:sz w:val="19"/>
+                <w:szCs w:val="19"/>
+              </w:rPr>
+              <w:t xml:space="preserve">Processual". Esta aplicação deve gerar o resultado da correção diretamente</w:t>
+            </w:r>
+          </w:p>
+          <w:p>
+            <w:pPr>
+              <w:spacing w:after="40"/>
+            </w:pPr>
+            <w:r>
+              <w:rPr>
+                <w:rFonts w:ascii="Consolas" w:cs="Consolas" w:eastAsia="Consolas" w:hAnsi="Consolas"/>
+                <w:sz w:val="19"/>
+                <w:szCs w:val="19"/>
+              </w:rPr>
+              <w:t xml:space="preserve">na tela, chamando a API da Anthropic — sem exigir que eu copie e cole um</w:t>
+            </w:r>
+          </w:p>
+          <w:p>
+            <w:pPr>
+              <w:spacing w:after="40"/>
+            </w:pPr>
+            <w:r>
+              <w:rPr>
+                <w:rFonts w:ascii="Consolas" w:cs="Consolas" w:eastAsia="Consolas" w:hAnsi="Consolas"/>
+                <w:sz w:val="19"/>
+                <w:szCs w:val="19"/>
+              </w:rPr>
+              <w:t xml:space="preserve">prompt em outra ferramenta.</w:t>
             </w:r>
           </w:p>
           <w:p>
@@ -709,59 +743,7 @@
                 <w:sz w:val="19"/>
                 <w:szCs w:val="19"/>
               </w:rPr>
-              <w:t xml:space="preserve">- Uma área de texto grande para colar o trecho da peça do aluno</w:t>
-            </w:r>
-          </w:p>
-          <w:p>
-            <w:pPr>
-              <w:spacing w:after="40"/>
-            </w:pPr>
-            <w:r>
-              <w:rPr>
-                <w:rFonts w:ascii="Consolas" w:cs="Consolas" w:eastAsia="Consolas" w:hAnsi="Consolas"/>
-                <w:sz w:val="19"/>
-                <w:szCs w:val="19"/>
-              </w:rPr>
-              <w:t xml:space="preserve">- Uma lista fixa e visível dos critérios de correção usados: estrutura do</w:t>
-            </w:r>
-          </w:p>
-          <w:p>
-            <w:pPr>
-              <w:spacing w:after="40"/>
-            </w:pPr>
-            <w:r>
-              <w:rPr>
-                <w:rFonts w:ascii="Consolas" w:cs="Consolas" w:eastAsia="Consolas" w:hAnsi="Consolas"/>
-                <w:sz w:val="19"/>
-                <w:szCs w:val="19"/>
-              </w:rPr>
-              <w:t xml:space="preserve">  rito processual, fundamentação do pedido, técnica de redação e coesão</w:t>
-            </w:r>
-          </w:p>
-          <w:p>
-            <w:pPr>
-              <w:spacing w:after="40"/>
-            </w:pPr>
-            <w:r>
-              <w:rPr>
-                <w:rFonts w:ascii="Consolas" w:cs="Consolas" w:eastAsia="Consolas" w:hAnsi="Consolas"/>
-                <w:sz w:val="19"/>
-                <w:szCs w:val="19"/>
-              </w:rPr>
-              <w:t xml:space="preserve">  textual</w:t>
-            </w:r>
-          </w:p>
-          <w:p>
-            <w:pPr>
-              <w:spacing w:after="40"/>
-            </w:pPr>
-            <w:r>
-              <w:rPr>
-                <w:rFonts w:ascii="Consolas" w:cs="Consolas" w:eastAsia="Consolas" w:hAnsi="Consolas"/>
-                <w:sz w:val="19"/>
-                <w:szCs w:val="19"/>
-              </w:rPr>
-              <w:t xml:space="preserve">- Um botão "Gerar prompt de correção"</w:t>
+              <w:t xml:space="preserve">A interface deve ter:</w:t>
             </w:r>
           </w:p>
           <w:p>
@@ -787,85 +769,462 @@
                 <w:sz w:val="19"/>
                 <w:szCs w:val="19"/>
               </w:rPr>
-              <w:t xml:space="preserve">Ao clicar, a aplicação deve montar automaticamente, num campo de texto</w:t>
-            </w:r>
-          </w:p>
-          <w:p>
-            <w:pPr>
-              <w:spacing w:after="40"/>
-            </w:pPr>
-            <w:r>
-              <w:rPr>
-                <w:rFonts w:ascii="Consolas" w:cs="Consolas" w:eastAsia="Consolas" w:hAnsi="Consolas"/>
-                <w:sz w:val="19"/>
-                <w:szCs w:val="19"/>
-              </w:rPr>
-              <w:t xml:space="preserve">abaixo, um prompt completo pedindo à IA para atuar como avaliador de banca</w:t>
-            </w:r>
-          </w:p>
-          <w:p>
-            <w:pPr>
-              <w:spacing w:after="40"/>
-            </w:pPr>
-            <w:r>
-              <w:rPr>
-                <w:rFonts w:ascii="Consolas" w:cs="Consolas" w:eastAsia="Consolas" w:hAnsi="Consolas"/>
-                <w:sz w:val="19"/>
-                <w:szCs w:val="19"/>
-              </w:rPr>
-              <w:t xml:space="preserve">examinadora rigoroso, mas justo, aplicando exatamente os critérios de</w:t>
-            </w:r>
-          </w:p>
-          <w:p>
-            <w:pPr>
-              <w:spacing w:after="40"/>
-            </w:pPr>
-            <w:r>
-              <w:rPr>
-                <w:rFonts w:ascii="Consolas" w:cs="Consolas" w:eastAsia="Consolas" w:hAnsi="Consolas"/>
-                <w:sz w:val="19"/>
-                <w:szCs w:val="19"/>
-              </w:rPr>
-              <w:t xml:space="preserve">correção listados na tela, comentando cada um separadamente e fechando com</w:t>
-            </w:r>
-          </w:p>
-          <w:p>
-            <w:pPr>
-              <w:spacing w:after="40"/>
-            </w:pPr>
-            <w:r>
-              <w:rPr>
-                <w:rFonts w:ascii="Consolas" w:cs="Consolas" w:eastAsia="Consolas" w:hAnsi="Consolas"/>
-                <w:sz w:val="19"/>
-                <w:szCs w:val="19"/>
-              </w:rPr>
-              <w:t xml:space="preserve">uma nota de 0 a 10 e uma justificativa breve. O prompt deve incluir o texto</w:t>
-            </w:r>
-          </w:p>
-          <w:p>
-            <w:pPr>
-              <w:spacing w:after="40"/>
-            </w:pPr>
-            <w:r>
-              <w:rPr>
-                <w:rFonts w:ascii="Consolas" w:cs="Consolas" w:eastAsia="Consolas" w:hAnsi="Consolas"/>
-                <w:sz w:val="19"/>
-                <w:szCs w:val="19"/>
-              </w:rPr>
-              <w:t xml:space="preserve">colado pelo professor. Incluir um botão "Copiar prompt". Visual limpo e</w:t>
-            </w:r>
-          </w:p>
-          <w:p>
-            <w:pPr>
-              <w:spacing w:after="40"/>
-            </w:pPr>
-            <w:r>
-              <w:rPr>
-                <w:rFonts w:ascii="Consolas" w:cs="Consolas" w:eastAsia="Consolas" w:hAnsi="Consolas"/>
-                <w:sz w:val="19"/>
-                <w:szCs w:val="19"/>
-              </w:rPr>
-              <w:t xml:space="preserve">profissional, cores sóbrias, consistente com a aplicação anterior.</w:t>
+              <w:t xml:space="preserve">- Um seletor de "peça de exemplo" (ver lista de exemplos abaixo), para testar</w:t>
+            </w:r>
+          </w:p>
+          <w:p>
+            <w:pPr>
+              <w:spacing w:after="40"/>
+            </w:pPr>
+            <w:r>
+              <w:rPr>
+                <w:rFonts w:ascii="Consolas" w:cs="Consolas" w:eastAsia="Consolas" w:hAnsi="Consolas"/>
+                <w:sz w:val="19"/>
+                <w:szCs w:val="19"/>
+              </w:rPr>
+              <w:t xml:space="preserve">  rapidamente, além de uma área de texto onde eu possa colar qualquer outra</w:t>
+            </w:r>
+          </w:p>
+          <w:p>
+            <w:pPr>
+              <w:spacing w:after="40"/>
+            </w:pPr>
+            <w:r>
+              <w:rPr>
+                <w:rFonts w:ascii="Consolas" w:cs="Consolas" w:eastAsia="Consolas" w:hAnsi="Consolas"/>
+                <w:sz w:val="19"/>
+                <w:szCs w:val="19"/>
+              </w:rPr>
+              <w:t xml:space="preserve">  peça</w:t>
+            </w:r>
+          </w:p>
+          <w:p>
+            <w:pPr>
+              <w:spacing w:after="40"/>
+            </w:pPr>
+            <w:r>
+              <w:rPr>
+                <w:rFonts w:ascii="Consolas" w:cs="Consolas" w:eastAsia="Consolas" w:hAnsi="Consolas"/>
+                <w:sz w:val="19"/>
+                <w:szCs w:val="19"/>
+              </w:rPr>
+              <w:t xml:space="preserve">- Um painel de parâmetros de correção que eu possa ajustar antes de corrigir</w:t>
+            </w:r>
+          </w:p>
+          <w:p>
+            <w:pPr>
+              <w:spacing w:after="40"/>
+            </w:pPr>
+            <w:r>
+              <w:rPr>
+                <w:rFonts w:ascii="Consolas" w:cs="Consolas" w:eastAsia="Consolas" w:hAnsi="Consolas"/>
+                <w:sz w:val="19"/>
+                <w:szCs w:val="19"/>
+              </w:rPr>
+              <w:t xml:space="preserve">  (ver lista de parâmetros abaixo)</w:t>
+            </w:r>
+          </w:p>
+          <w:p>
+            <w:pPr>
+              <w:spacing w:after="40"/>
+            </w:pPr>
+            <w:r>
+              <w:rPr>
+                <w:rFonts w:ascii="Consolas" w:cs="Consolas" w:eastAsia="Consolas" w:hAnsi="Consolas"/>
+                <w:sz w:val="19"/>
+                <w:szCs w:val="19"/>
+              </w:rPr>
+              <w:t xml:space="preserve">- Um botão "Corrigir peça"</w:t>
+            </w:r>
+          </w:p>
+          <w:p>
+            <w:pPr>
+              <w:spacing w:after="40"/>
+            </w:pPr>
+            <w:r>
+              <w:rPr>
+                <w:rFonts w:ascii="Consolas" w:cs="Consolas" w:eastAsia="Consolas" w:hAnsi="Consolas"/>
+                <w:sz w:val="19"/>
+                <w:szCs w:val="19"/>
+              </w:rPr>
+              <w:t xml:space="preserve">- Uma área de resultado mostrando o comentário por critério e a nota sugerida,</w:t>
+            </w:r>
+          </w:p>
+          <w:p>
+            <w:pPr>
+              <w:spacing w:after="40"/>
+            </w:pPr>
+            <w:r>
+              <w:rPr>
+                <w:rFonts w:ascii="Consolas" w:cs="Consolas" w:eastAsia="Consolas" w:hAnsi="Consolas"/>
+                <w:sz w:val="19"/>
+                <w:szCs w:val="19"/>
+              </w:rPr>
+              <w:t xml:space="preserve">  com indicador de carregamento enquanto a IA gera a resposta</w:t>
+            </w:r>
+          </w:p>
+          <w:p>
+            <w:pPr>
+              <w:spacing w:after="40"/>
+            </w:pPr>
+            <w:r>
+              <w:rPr>
+                <w:rFonts w:ascii="Consolas" w:cs="Consolas" w:eastAsia="Consolas" w:hAnsi="Consolas"/>
+                <w:sz w:val="19"/>
+                <w:szCs w:val="19"/>
+              </w:rPr>
+              <w:t xml:space="preserve"/>
+            </w:r>
+          </w:p>
+          <w:p>
+            <w:pPr>
+              <w:spacing w:after="40"/>
+            </w:pPr>
+            <w:r>
+              <w:rPr>
+                <w:rFonts w:ascii="Consolas" w:cs="Consolas" w:eastAsia="Consolas" w:hAnsi="Consolas"/>
+                <w:sz w:val="19"/>
+                <w:szCs w:val="19"/>
+              </w:rPr>
+              <w:t xml:space="preserve">Parâmetros de correção configuráveis por mim:</w:t>
+            </w:r>
+          </w:p>
+          <w:p>
+            <w:pPr>
+              <w:spacing w:after="40"/>
+            </w:pPr>
+            <w:r>
+              <w:rPr>
+                <w:rFonts w:ascii="Consolas" w:cs="Consolas" w:eastAsia="Consolas" w:hAnsi="Consolas"/>
+                <w:sz w:val="19"/>
+                <w:szCs w:val="19"/>
+              </w:rPr>
+              <w:t xml:space="preserve">- Critérios a avaliar (caixas de seleção, todas marcadas por padrão):</w:t>
+            </w:r>
+          </w:p>
+          <w:p>
+            <w:pPr>
+              <w:spacing w:after="40"/>
+            </w:pPr>
+            <w:r>
+              <w:rPr>
+                <w:rFonts w:ascii="Consolas" w:cs="Consolas" w:eastAsia="Consolas" w:hAnsi="Consolas"/>
+                <w:sz w:val="19"/>
+                <w:szCs w:val="19"/>
+              </w:rPr>
+              <w:t xml:space="preserve">  Fundamentação jurídica, Estrutura do rito processual, Técnica de redação,</w:t>
+            </w:r>
+          </w:p>
+          <w:p>
+            <w:pPr>
+              <w:spacing w:after="40"/>
+            </w:pPr>
+            <w:r>
+              <w:rPr>
+                <w:rFonts w:ascii="Consolas" w:cs="Consolas" w:eastAsia="Consolas" w:hAnsi="Consolas"/>
+                <w:sz w:val="19"/>
+                <w:szCs w:val="19"/>
+              </w:rPr>
+              <w:t xml:space="preserve">  Coesão textual, Uso correto de terminologia jurídica</w:t>
+            </w:r>
+          </w:p>
+          <w:p>
+            <w:pPr>
+              <w:spacing w:after="40"/>
+            </w:pPr>
+            <w:r>
+              <w:rPr>
+                <w:rFonts w:ascii="Consolas" w:cs="Consolas" w:eastAsia="Consolas" w:hAnsi="Consolas"/>
+                <w:sz w:val="19"/>
+                <w:szCs w:val="19"/>
+              </w:rPr>
+              <w:t xml:space="preserve">- Tom do comentário (seleção única): Rigoroso / Construtivo / Motivacional</w:t>
+            </w:r>
+          </w:p>
+          <w:p>
+            <w:pPr>
+              <w:spacing w:after="40"/>
+            </w:pPr>
+            <w:r>
+              <w:rPr>
+                <w:rFonts w:ascii="Consolas" w:cs="Consolas" w:eastAsia="Consolas" w:hAnsi="Consolas"/>
+                <w:sz w:val="19"/>
+                <w:szCs w:val="19"/>
+              </w:rPr>
+              <w:t xml:space="preserve">- Nível da turma (seleção única): Iniciante (1º-3º semestre) / Intermediário</w:t>
+            </w:r>
+          </w:p>
+          <w:p>
+            <w:pPr>
+              <w:spacing w:after="40"/>
+            </w:pPr>
+            <w:r>
+              <w:rPr>
+                <w:rFonts w:ascii="Consolas" w:cs="Consolas" w:eastAsia="Consolas" w:hAnsi="Consolas"/>
+                <w:sz w:val="19"/>
+                <w:szCs w:val="19"/>
+              </w:rPr>
+              <w:t xml:space="preserve">  (4º-6º semestre) / Avançado (7º-10º semestre)</w:t>
+            </w:r>
+          </w:p>
+          <w:p>
+            <w:pPr>
+              <w:spacing w:after="40"/>
+            </w:pPr>
+            <w:r>
+              <w:rPr>
+                <w:rFonts w:ascii="Consolas" w:cs="Consolas" w:eastAsia="Consolas" w:hAnsi="Consolas"/>
+                <w:sz w:val="19"/>
+                <w:szCs w:val="19"/>
+              </w:rPr>
+              <w:t xml:space="preserve">- Nota mínima considerada aprovação (campo numérico, padrão 6)</w:t>
+            </w:r>
+          </w:p>
+          <w:p>
+            <w:pPr>
+              <w:spacing w:after="40"/>
+            </w:pPr>
+            <w:r>
+              <w:rPr>
+                <w:rFonts w:ascii="Consolas" w:cs="Consolas" w:eastAsia="Consolas" w:hAnsi="Consolas"/>
+                <w:sz w:val="19"/>
+                <w:szCs w:val="19"/>
+              </w:rPr>
+              <w:t xml:space="preserve"/>
+            </w:r>
+          </w:p>
+          <w:p>
+            <w:pPr>
+              <w:spacing w:after="40"/>
+            </w:pPr>
+            <w:r>
+              <w:rPr>
+                <w:rFonts w:ascii="Consolas" w:cs="Consolas" w:eastAsia="Consolas" w:hAnsi="Consolas"/>
+                <w:sz w:val="19"/>
+                <w:szCs w:val="19"/>
+              </w:rPr>
+              <w:t xml:space="preserve">Ao clicar em "Corrigir peça", monte internamente um prompt estruturado</w:t>
+            </w:r>
+          </w:p>
+          <w:p>
+            <w:pPr>
+              <w:spacing w:after="40"/>
+            </w:pPr>
+            <w:r>
+              <w:rPr>
+                <w:rFonts w:ascii="Consolas" w:cs="Consolas" w:eastAsia="Consolas" w:hAnsi="Consolas"/>
+                <w:sz w:val="19"/>
+                <w:szCs w:val="19"/>
+              </w:rPr>
+              <w:t xml:space="preserve">(persona = avaliador de banca examinadora, ajustada ao tom e ao nível</w:t>
+            </w:r>
+          </w:p>
+          <w:p>
+            <w:pPr>
+              <w:spacing w:after="40"/>
+            </w:pPr>
+            <w:r>
+              <w:rPr>
+                <w:rFonts w:ascii="Consolas" w:cs="Consolas" w:eastAsia="Consolas" w:hAnsi="Consolas"/>
+                <w:sz w:val="19"/>
+                <w:szCs w:val="19"/>
+              </w:rPr>
+              <w:t xml:space="preserve">escolhidos; critérios = os marcados; peça = o texto informado ou o exemplo</w:t>
+            </w:r>
+          </w:p>
+          <w:p>
+            <w:pPr>
+              <w:spacing w:after="40"/>
+            </w:pPr>
+            <w:r>
+              <w:rPr>
+                <w:rFonts w:ascii="Consolas" w:cs="Consolas" w:eastAsia="Consolas" w:hAnsi="Consolas"/>
+                <w:sz w:val="19"/>
+                <w:szCs w:val="19"/>
+              </w:rPr>
+              <w:t xml:space="preserve">selecionado) e envie para a API da Anthropic. Exiba o resultado formatado: um</w:t>
+            </w:r>
+          </w:p>
+          <w:p>
+            <w:pPr>
+              <w:spacing w:after="40"/>
+            </w:pPr>
+            <w:r>
+              <w:rPr>
+                <w:rFonts w:ascii="Consolas" w:cs="Consolas" w:eastAsia="Consolas" w:hAnsi="Consolas"/>
+                <w:sz w:val="19"/>
+                <w:szCs w:val="19"/>
+              </w:rPr>
+              <w:t xml:space="preserve">comentário para cada critério marcado, seguido de uma nota de 0 a 10 e uma</w:t>
+            </w:r>
+          </w:p>
+          <w:p>
+            <w:pPr>
+              <w:spacing w:after="40"/>
+            </w:pPr>
+            <w:r>
+              <w:rPr>
+                <w:rFonts w:ascii="Consolas" w:cs="Consolas" w:eastAsia="Consolas" w:hAnsi="Consolas"/>
+                <w:sz w:val="19"/>
+                <w:szCs w:val="19"/>
+              </w:rPr>
+              <w:t xml:space="preserve">justificativa breve.</w:t>
+            </w:r>
+          </w:p>
+          <w:p>
+            <w:pPr>
+              <w:spacing w:after="40"/>
+            </w:pPr>
+            <w:r>
+              <w:rPr>
+                <w:rFonts w:ascii="Consolas" w:cs="Consolas" w:eastAsia="Consolas" w:hAnsi="Consolas"/>
+                <w:sz w:val="19"/>
+                <w:szCs w:val="19"/>
+              </w:rPr>
+              <w:t xml:space="preserve"/>
+            </w:r>
+          </w:p>
+          <w:p>
+            <w:pPr>
+              <w:spacing w:after="40"/>
+            </w:pPr>
+            <w:r>
+              <w:rPr>
+                <w:rFonts w:ascii="Consolas" w:cs="Consolas" w:eastAsia="Consolas" w:hAnsi="Consolas"/>
+                <w:sz w:val="19"/>
+                <w:szCs w:val="19"/>
+              </w:rPr>
+              <w:t xml:space="preserve">Peças de exemplo para incluir no seletor: usar os dois exemplos fornecidos</w:t>
+            </w:r>
+          </w:p>
+          <w:p>
+            <w:pPr>
+              <w:spacing w:after="40"/>
+            </w:pPr>
+            <w:r>
+              <w:rPr>
+                <w:rFonts w:ascii="Consolas" w:cs="Consolas" w:eastAsia="Consolas" w:hAnsi="Consolas"/>
+                <w:sz w:val="19"/>
+                <w:szCs w:val="19"/>
+              </w:rPr>
+              <w:t xml:space="preserve">abaixo, com os nomes "Exemplo 1 — Ação de Indenização" e "Exemplo 2 — Recurso</w:t>
+            </w:r>
+          </w:p>
+          <w:p>
+            <w:pPr>
+              <w:spacing w:after="40"/>
+            </w:pPr>
+            <w:r>
+              <w:rPr>
+                <w:rFonts w:ascii="Consolas" w:cs="Consolas" w:eastAsia="Consolas" w:hAnsi="Consolas"/>
+                <w:sz w:val="19"/>
+                <w:szCs w:val="19"/>
+              </w:rPr>
+              <w:t xml:space="preserve">de Apelação (Guarda Compartilhada)".</w:t>
+            </w:r>
+          </w:p>
+          <w:p>
+            <w:pPr>
+              <w:spacing w:after="40"/>
+            </w:pPr>
+            <w:r>
+              <w:rPr>
+                <w:rFonts w:ascii="Consolas" w:cs="Consolas" w:eastAsia="Consolas" w:hAnsi="Consolas"/>
+                <w:sz w:val="19"/>
+                <w:szCs w:val="19"/>
+              </w:rPr>
+              <w:t xml:space="preserve"/>
+            </w:r>
+          </w:p>
+          <w:p>
+            <w:pPr>
+              <w:spacing w:after="40"/>
+            </w:pPr>
+            <w:r>
+              <w:rPr>
+                <w:rFonts w:ascii="Consolas" w:cs="Consolas" w:eastAsia="Consolas" w:hAnsi="Consolas"/>
+                <w:sz w:val="19"/>
+                <w:szCs w:val="19"/>
+              </w:rPr>
+              <w:t xml:space="preserve">Observação técnica importante: esta aplicação precisa de uma chave de API da</w:t>
+            </w:r>
+          </w:p>
+          <w:p>
+            <w:pPr>
+              <w:spacing w:after="40"/>
+            </w:pPr>
+            <w:r>
+              <w:rPr>
+                <w:rFonts w:ascii="Consolas" w:cs="Consolas" w:eastAsia="Consolas" w:hAnsi="Consolas"/>
+                <w:sz w:val="19"/>
+                <w:szCs w:val="19"/>
+              </w:rPr>
+              <w:t xml:space="preserve">Anthropic para gerar o resultado diretamente na tela. Configure a chamada da</w:t>
+            </w:r>
+          </w:p>
+          <w:p>
+            <w:pPr>
+              <w:spacing w:after="40"/>
+            </w:pPr>
+            <w:r>
+              <w:rPr>
+                <w:rFonts w:ascii="Consolas" w:cs="Consolas" w:eastAsia="Consolas" w:hAnsi="Consolas"/>
+                <w:sz w:val="19"/>
+                <w:szCs w:val="19"/>
+              </w:rPr>
+              <w:t xml:space="preserve">forma mais adequada a este ambiente (usar uma chave já configurada, se</w:t>
+            </w:r>
+          </w:p>
+          <w:p>
+            <w:pPr>
+              <w:spacing w:after="40"/>
+            </w:pPr>
+            <w:r>
+              <w:rPr>
+                <w:rFonts w:ascii="Consolas" w:cs="Consolas" w:eastAsia="Consolas" w:hAnsi="Consolas"/>
+                <w:sz w:val="19"/>
+                <w:szCs w:val="19"/>
+              </w:rPr>
+              <w:t xml:space="preserve">houver, ou incluir um campo na própria tela para eu inserir minha chave antes</w:t>
+            </w:r>
+          </w:p>
+          <w:p>
+            <w:pPr>
+              <w:spacing w:after="40"/>
+            </w:pPr>
+            <w:r>
+              <w:rPr>
+                <w:rFonts w:ascii="Consolas" w:cs="Consolas" w:eastAsia="Consolas" w:hAnsi="Consolas"/>
+                <w:sz w:val="19"/>
+                <w:szCs w:val="19"/>
+              </w:rPr>
+              <w:t xml:space="preserve">de usar). Se não for possível fazer a chamada direta por qualquer motivo, me</w:t>
+            </w:r>
+          </w:p>
+          <w:p>
+            <w:pPr>
+              <w:spacing w:after="40"/>
+            </w:pPr>
+            <w:r>
+              <w:rPr>
+                <w:rFonts w:ascii="Consolas" w:cs="Consolas" w:eastAsia="Consolas" w:hAnsi="Consolas"/>
+                <w:sz w:val="19"/>
+                <w:szCs w:val="19"/>
+              </w:rPr>
+              <w:t xml:space="preserve">avise antes de prosseguir para decidirmos juntos a alternativa (por exemplo,</w:t>
+            </w:r>
+          </w:p>
+          <w:p>
+            <w:pPr>
+              <w:spacing w:after="40"/>
+            </w:pPr>
+            <w:r>
+              <w:rPr>
+                <w:rFonts w:ascii="Consolas" w:cs="Consolas" w:eastAsia="Consolas" w:hAnsi="Consolas"/>
+                <w:sz w:val="19"/>
+                <w:szCs w:val="19"/>
+              </w:rPr>
+              <w:t xml:space="preserve">voltar ao modelo de copiar e colar o prompt, como no Caso 2).</w:t>
             </w:r>
           </w:p>
         </w:tc>
@@ -896,7 +1255,7 @@
         <w:spacing w:after="100"/>
       </w:pPr>
       <w:r>
-        <w:t xml:space="preserve">Mostrar a aplicação já construída, com os critérios de correção visíveis na tela.</w:t>
+        <w:t xml:space="preserve">Mostrar a aplicação já construída, com os parâmetros de correção visíveis na tela.</w:t>
       </w:r>
     </w:p>
     <w:p>
@@ -909,7 +1268,7 @@
         <w:spacing w:after="100"/>
       </w:pPr>
       <w:r>
-        <w:t xml:space="preserve">Colar um trecho da peça fictícia já usada na demonstração do Gem (Módulo 1) — ex.: o parágrafo "DA TUTELA DE URGÊNCIA".</w:t>
+        <w:t xml:space="preserve">Selecionar o "Exemplo 1 — Ação de Indenização" no seletor (ou colar outro trecho, se preferir).</w:t>
       </w:r>
     </w:p>
     <w:p>
@@ -922,7 +1281,7 @@
         <w:spacing w:after="100"/>
       </w:pPr>
       <w:r>
-        <w:t xml:space="preserve">Clicar em "Gerar prompt de correção" e mostrar o prompt estruturado montado automaticamente.</w:t>
+        <w:t xml:space="preserve">Ajustar ao vivo um parâmetro — por exemplo, mudar o tom de "Rigoroso" para "Construtivo" — para mostrar que o resultado muda de acordo com a escolha.</w:t>
       </w:r>
     </w:p>
     <w:p>
@@ -935,7 +1294,7 @@
         <w:spacing w:after="100"/>
       </w:pPr>
       <w:r>
-        <w:t xml:space="preserve">Copiar o prompt e colar na ferramenta de IA já aberta.</w:t>
+        <w:t xml:space="preserve">Clicar em "Corrigir peça" e aguardar o resultado.</w:t>
       </w:r>
     </w:p>
     <w:p>
@@ -948,7 +1307,7 @@
         <w:spacing w:after="100"/>
       </w:pPr>
       <w:r>
-        <w:t xml:space="preserve">Mostrar o comentário por critério e a nota sugerida gerados a partir dali.</w:t>
+        <w:t xml:space="preserve">Mostrar o comentário por critério e a nota sugerida, já na tela, sem sair da aplicação.</w:t>
       </w:r>
     </w:p>
     <w:p>
@@ -976,7 +1335,7 @@
         <w:spacing w:after="80"/>
       </w:pPr>
       <w:r>
-        <w:t xml:space="preserve">Os critérios de correção ficam fixos e visíveis na tela — o professor não precisa lembrar ou reescrever a mesma instrução toda vez que for corrigir.</w:t>
+        <w:t xml:space="preserve">Os critérios de correção e o tom ficam configuráveis — o mesmo professor pode ter um corretor "rigoroso" para peças de avaliação formal e outro "construtivo" para exercício de treino.</w:t>
       </w:r>
     </w:p>
     <w:p>
@@ -1086,6 +1445,234 @@
       </w:pPr>
       <w:r>
         <w:t xml:space="preserve">Se faltar tempo para os dois casos: priorizar o Caso 2 — fecha melhor o conteúdo da oficina inteira (governança, prompt e produtividade reunidos em uma única ferramenta).</w:t>
+      </w:r>
+    </w:p>
+    <w:p>
+      <w:pPr>
+        <w:pStyle w:val="ListParagraph"/>
+        <w:numPr>
+          <w:ilvl w:val="0"/>
+          <w:numId w:val="1"/>
+        </w:numPr>
+        <w:spacing w:after="80"/>
+      </w:pPr>
+      <w:r>
+        <w:t xml:space="preserve">Se a chamada direta à API do Caso 3 não funcionar em sala (sem internet estável, chave não configurada a tempo): usar o modelo de copiar e colar prompt do Caso 2 como alternativa, ou mostrar apenas o print do resultado já testado antes da aula.</w:t>
+      </w:r>
+    </w:p>
+    <w:p>
+      <w:pPr>
+        <w:pStyle w:val="Heading1"/>
+        <w:spacing w:after="120" w:before="280"/>
+      </w:pPr>
+      <w:r>
+        <w:t xml:space="preserve">Anexo — peças de exemplo para o seletor do Caso 3</w:t>
+      </w:r>
+    </w:p>
+    <w:tbl>
+      <w:tblPr>
+        <w:tblW w:type="pct" w:w="100%"/>
+        <w:tblBorders>
+          <w:top w:val="single" w:color="2E5E3E" w:sz="4"/>
+          <w:left w:val="single" w:color="2E5E3E" w:sz="4"/>
+          <w:bottom w:val="single" w:color="2E5E3E" w:sz="4"/>
+          <w:right w:val="single" w:color="2E5E3E" w:sz="4"/>
+          <w:insideH w:val="single" w:color="auto" w:sz="4"/>
+          <w:insideV w:val="single" w:color="auto" w:sz="4"/>
+        </w:tblBorders>
+      </w:tblPr>
+      <w:tblGrid>
+        <w:gridCol w:w="100"/>
+      </w:tblGrid>
+      <w:tr>
+        <w:tc>
+          <w:tcPr>
+            <w:tcW w:type="pct" w:w="100%"/>
+            <w:shd w:fill="EFF6F1" w:val="clear"/>
+            <w:tcMar>
+              <w:top w:type="dxa" w:w="130"/>
+              <w:left w:type="dxa" w:w="200"/>
+              <w:bottom w:type="dxa" w:w="130"/>
+              <w:right w:type="dxa" w:w="200"/>
+            </w:tcMar>
+          </w:tcPr>
+          <w:p>
+            <w:r>
+              <w:rPr>
+                <w:i/>
+                <w:iCs/>
+              </w:rPr>
+              <w:t xml:space="preserve">Aviso: peças inteiramente fictícias, elaboradas só para fins didáticos desta demonstração. Partes, fatos e números são inventados. Contêm, de propósito, pontos a melhorar, para que o corretor tenha o que apontar durante a demonstração ao vivo.</w:t>
+            </w:r>
+          </w:p>
+        </w:tc>
+      </w:tr>
+    </w:tbl>
+    <w:p>
+      <w:pPr>
+        <w:spacing w:after="160"/>
+      </w:pPr>
+    </w:p>
+    <w:p>
+      <w:pPr>
+        <w:spacing w:after="60" w:before="100"/>
+      </w:pPr>
+      <w:r>
+        <w:rPr>
+          <w:b/>
+          <w:bCs/>
+          <w:color w:val="1F3864"/>
+          <w:sz w:val="20"/>
+          <w:szCs w:val="20"/>
+        </w:rPr>
+        <w:t xml:space="preserve">Exemplo 1 — Ação de Indenização (a mesma peça já usada no Módulo 1)</w:t>
+      </w:r>
+    </w:p>
+    <w:p>
+      <w:pPr>
+        <w:spacing w:after="140"/>
+      </w:pPr>
+      <w:r>
+        <w:rPr>
+          <w:sz w:val="20"/>
+          <w:szCs w:val="20"/>
+        </w:rPr>
+        <w:t xml:space="preserve">EXCELENTÍSSIMO(A) SENHOR(A) DOUTOR(A) JUIZ(A) DE DIREITO DA ___ VARA CÍVEL DA COMARCA FICTÍCIA</w:t>
+      </w:r>
+    </w:p>
+    <w:p>
+      <w:pPr>
+        <w:spacing w:after="140"/>
+      </w:pPr>
+      <w:r>
+        <w:rPr>
+          <w:sz w:val="20"/>
+          <w:szCs w:val="20"/>
+        </w:rPr>
+        <w:t xml:space="preserve">MARIA FICTÍCIA DA SILVA, já qualificada nos autos, vem, respeitosamente, à presença de Vossa Excelência, propor a presente AÇÃO DE INDENIZAÇÃO POR DANOS MORAIS COM PEDIDO DE TUTELA DE URGÊNCIA em face de COMÉRCIO FICTÍCIO DE ELETRODOMÉSTICOS LTDA., pelos fatos e fundamentos a seguir expostos.</w:t>
+      </w:r>
+    </w:p>
+    <w:p>
+      <w:pPr>
+        <w:spacing w:after="140"/>
+      </w:pPr>
+      <w:r>
+        <w:rPr>
+          <w:sz w:val="20"/>
+          <w:szCs w:val="20"/>
+        </w:rPr>
+        <w:t xml:space="preserve">DOS FATOS: A autora adquiriu um produto na loja ré e, desde então, vem sofrendo com o descumprimento do prazo de entrega prometido, o que já dura mais de 60 dias. Diversas tentativas de contato foram feitas, sem sucesso.</w:t>
+      </w:r>
+    </w:p>
+    <w:p>
+      <w:pPr>
+        <w:spacing w:after="140"/>
+      </w:pPr>
+      <w:r>
+        <w:rPr>
+          <w:sz w:val="20"/>
+          <w:szCs w:val="20"/>
+        </w:rPr>
+        <w:t xml:space="preserve">DO DIREITO: O Código de Defesa do Consumidor prevê a responsabilidade do fornecedor por falha na prestação do serviço. O atraso configura descumprimento contratual, e isso já basta para caracterizar o dano moral, que é presumido em situações como essa, sendo desnecessária qualquer outra comprovação.</w:t>
+      </w:r>
+    </w:p>
+    <w:p>
+      <w:pPr>
+        <w:spacing w:after="140"/>
+      </w:pPr>
+      <w:r>
+        <w:rPr>
+          <w:sz w:val="20"/>
+          <w:szCs w:val="20"/>
+        </w:rPr>
+        <w:t xml:space="preserve">DA TUTELA DE URGÊNCIA: Estão presentes os requisitos legais para a concessão da tutela de urgência, motivo pelo qual requer-se sua concessão, determinando-se que a ré entregue o produto em 24 horas, sob pena de multa diária.</w:t>
+      </w:r>
+    </w:p>
+    <w:p>
+      <w:pPr>
+        <w:spacing w:after="140"/>
+      </w:pPr>
+      <w:r>
+        <w:rPr>
+          <w:sz w:val="20"/>
+          <w:szCs w:val="20"/>
+        </w:rPr>
+        <w:t xml:space="preserve">DOS PEDIDOS: a) a concessão da tutela de urgência, nos termos acima; b) a citação da ré; c) a procedência dos pedidos, condenando a ré ao pagamento de indenização por danos morais; d) custas e honorários. Dá-se à causa o valor de R$ 5.000,00.</w:t>
+      </w:r>
+    </w:p>
+    <w:p>
+      <w:pPr>
+        <w:spacing w:after="60" w:before="100"/>
+      </w:pPr>
+      <w:r>
+        <w:rPr>
+          <w:b/>
+          <w:bCs/>
+          <w:color w:val="1F3864"/>
+          <w:sz w:val="20"/>
+          <w:szCs w:val="20"/>
+        </w:rPr>
+        <w:t xml:space="preserve">Exemplo 2 — Recurso de Apelação (Guarda Compartilhada)</w:t>
+      </w:r>
+    </w:p>
+    <w:p>
+      <w:pPr>
+        <w:spacing w:after="140"/>
+      </w:pPr>
+      <w:r>
+        <w:rPr>
+          <w:sz w:val="20"/>
+          <w:szCs w:val="20"/>
+        </w:rPr>
+        <w:t xml:space="preserve">EXCELENTÍSSIMO(A) SENHOR(A) DESEMBARGADOR(A) RELATOR(A) DO TRIBUNAL DE JUSTIÇA FICTÍCIO</w:t>
+      </w:r>
+    </w:p>
+    <w:p>
+      <w:pPr>
+        <w:spacing w:after="140"/>
+      </w:pPr>
+      <w:r>
+        <w:rPr>
+          <w:sz w:val="20"/>
+          <w:szCs w:val="20"/>
+        </w:rPr>
+        <w:t xml:space="preserve">JOÃO FICTÍCIO DOS SANTOS, já qualificado nos autos da Ação de Guarda nº 0002020-30.2023.8.00.0000, não se conformando com a r. sentença que fixou a guarda unilateral em favor da genitora, vem, tempestivamente, interpor o presente RECURSO DE APELAÇÃO, pelas razões a seguir.</w:t>
+      </w:r>
+    </w:p>
+    <w:p>
+      <w:pPr>
+        <w:spacing w:after="140"/>
+      </w:pPr>
+      <w:r>
+        <w:rPr>
+          <w:sz w:val="20"/>
+          <w:szCs w:val="20"/>
+        </w:rPr>
+        <w:t xml:space="preserve">DOS FATOS: O apelante sempre participou ativamente da rotina do filho, e não concorda com a decisão do juízo a quo. A sentença não levou em conta a realidade da família.</w:t>
+      </w:r>
+    </w:p>
+    <w:p>
+      <w:pPr>
+        <w:spacing w:after="140"/>
+      </w:pPr>
+      <w:r>
+        <w:rPr>
+          <w:sz w:val="20"/>
+          <w:szCs w:val="20"/>
+        </w:rPr>
+        <w:t xml:space="preserve">DO DIREITO: A guarda compartilhada é o que há de mais moderno no Direito de Família, e deveria ter sido aplicada neste caso, pois é sempre melhor para a criança. O juízo errou ao não aplicar esse entendimento.</w:t>
+      </w:r>
+    </w:p>
+    <w:p>
+      <w:pPr>
+        <w:spacing w:after="140"/>
+      </w:pPr>
+      <w:r>
+        <w:rPr>
+          <w:sz w:val="20"/>
+          <w:szCs w:val="20"/>
+        </w:rPr>
+        <w:t xml:space="preserve">DO PEDIDO: Requer-se o provimento do recurso, para reformar a sentença e fixar a guarda compartilhada, nos termos do que já vem sendo decidido em outros processos parecidos.</w:t>
       </w:r>
     </w:p>
     <w:sectPr>

</xml_diff>